<commit_message>
feat: add missing occupations, fix template issues #BKDO-4271
</commit_message>
<xml_diff>
--- a/src/Bk.APG.Api/Templates/FormLetterGeneralElection_Romansh.docx
+++ b/src/Bk.APG.Api/Templates/FormLetterGeneralElection_Romansh.docx
@@ -765,6 +765,7 @@
                 <w:b/>
                 <w:bCs/>
                 <w:szCs w:val="15"/>
+                <w:lang w:val="en-US"/>
               </w:rPr>
               <w:t>&lt;&lt;[</w:t>
             </w:r>
@@ -773,6 +774,7 @@
                 <w:b/>
                 <w:bCs/>
                 <w:szCs w:val="15"/>
+                <w:lang w:val="en-US"/>
               </w:rPr>
               <w:t>member</w:t>
             </w:r>
@@ -781,6 +783,7 @@
                 <w:b/>
                 <w:bCs/>
                 <w:szCs w:val="15"/>
+                <w:lang w:val="en-US"/>
               </w:rPr>
               <w:t>.senderCity]&gt;&gt;, &lt;&lt;[</w:t>
             </w:r>
@@ -789,16 +792,18 @@
                 <w:b/>
                 <w:bCs/>
                 <w:szCs w:val="15"/>
-              </w:rPr>
-              <w:t>member</w:t>
+                <w:lang w:val="en-US"/>
+              </w:rPr>
+              <w:t>member.dateLetter]:"MMMM yyyy"</w:t>
             </w:r>
             <w:r>
               <w:rPr>
                 <w:b/>
                 <w:bCs/>
                 <w:szCs w:val="15"/>
-              </w:rPr>
-              <w:t>.dateLetter]&gt;&gt;</w:t>
+                <w:lang w:val="en-US"/>
+              </w:rPr>
+              <w:t>&gt;&gt;</w:t>
             </w:r>
           </w:p>
         </w:tc>
@@ -3309,7 +3314,6 @@
   <w:style w:type="character" w:default="1" w:styleId="Absatz-Standardschriftart">
     <w:name w:val="Default Paragraph Font"/>
     <w:uiPriority w:val="1"/>
-    <w:semiHidden/>
     <w:unhideWhenUsed/>
   </w:style>
   <w:style w:type="table" w:default="1" w:styleId="NormaleTabelle">
@@ -3920,6 +3924,34 @@
     <w:rPr>
       <w:color w:val="605E5C"/>
       <w:shd w:val="clear" w:color="auto" w:fill="E1DFDD"/>
+    </w:rPr>
+  </w:style>
+  <w:style w:type="paragraph" w:styleId="HTMLVorformatiert">
+    <w:name w:val="HTML Preformatted"/>
+    <w:basedOn w:val="Standard"/>
+    <w:link w:val="HTMLVorformatiertZchn"/>
+    <w:uiPriority w:val="99"/>
+    <w:semiHidden/>
+    <w:unhideWhenUsed/>
+    <w:rsid w:val="00B04E10"/>
+    <w:rPr>
+      <w:rFonts w:ascii="Consolas" w:hAnsi="Consolas"/>
+    </w:rPr>
+  </w:style>
+  <w:style w:type="character" w:customStyle="1" w:styleId="HTMLVorformatiertZchn">
+    <w:name w:val="HTML Vorformatiert Zchn"/>
+    <w:basedOn w:val="Absatz-Standardschriftart"/>
+    <w:link w:val="HTMLVorformatiert"/>
+    <w:uiPriority w:val="99"/>
+    <w:semiHidden/>
+    <w:rsid w:val="00B04E10"/>
+    <w:rPr>
+      <w:rFonts w:ascii="Consolas" w:eastAsia="Times New Roman" w:hAnsi="Consolas" w:cs="Times New Roman"/>
+      <w:kern w:val="0"/>
+      <w:sz w:val="20"/>
+      <w:szCs w:val="20"/>
+      <w:lang w:eastAsia="de-CH"/>
+      <w14:ligatures w14:val="none"/>
     </w:rPr>
   </w:style>
 </w:styles>

</xml_diff>

<commit_message>
feat: add function texts in romansh, update templates #BKDO-5138
</commit_message>
<xml_diff>
--- a/src/Bk.APG.Api/Templates/FormLetterGeneralElection_Romansh.docx
+++ b/src/Bk.APG.Api/Templates/FormLetterGeneralElection_Romansh.docx
@@ -1986,6 +1986,14 @@
       <w:pPr>
         <w:rPr>
           <w:rFonts w:cs="Arial"/>
+          <w:lang w:val="en-US"/>
+        </w:rPr>
+      </w:pPr>
+    </w:p>
+    <w:p>
+      <w:pPr>
+        <w:rPr>
+          <w:rFonts w:cs="Arial"/>
           <w:lang w:val="it-CH"/>
         </w:rPr>
       </w:pPr>
@@ -2088,6 +2096,7 @@
           <w:rFonts w:cs="Arial"/>
           <w:lang w:val="en-US"/>
         </w:rPr>
+        <w:lastRenderedPageBreak/>
         <w:t>Salids amicabels</w:t>
       </w:r>
     </w:p>
@@ -2203,7 +2212,6 @@
           <w:highlight w:val="yellow"/>
           <w:lang w:val="en-US"/>
         </w:rPr>
-        <w:lastRenderedPageBreak/>
         <w:t>&lt;&lt;if [</w:t>
       </w:r>
       <w:r>
@@ -3314,6 +3322,7 @@
   <w:style w:type="character" w:default="1" w:styleId="Absatz-Standardschriftart">
     <w:name w:val="Default Paragraph Font"/>
     <w:uiPriority w:val="1"/>
+    <w:semiHidden/>
     <w:unhideWhenUsed/>
   </w:style>
   <w:style w:type="table" w:default="1" w:styleId="NormaleTabelle">

</xml_diff>